<commit_message>
Add legal materials, FAQ recommendations and inline document editor
</commit_message>
<xml_diff>
--- a/content/files/brand-claim.docx
+++ b/content/files/brand-claim.docx
@@ -2,6 +2,22 @@
 <file path=word/document.xml><?xml version="1.0" encoding="utf-8"?>
 <w:document xmlns:wpc="http://schemas.microsoft.com/office/word/2010/wordprocessingCanvas" xmlns:cx="http://schemas.microsoft.com/office/drawing/2014/chartex" xmlns:cx1="http://schemas.microsoft.com/office/drawing/2015/9/8/chartex" xmlns:cx2="http://schemas.microsoft.com/office/drawing/2015/10/21/chartex" xmlns:cx3="http://schemas.microsoft.com/office/drawing/2016/5/9/chartex" xmlns:cx4="http://schemas.microsoft.com/office/drawing/2016/5/10/chartex" xmlns:cx5="http://schemas.microsoft.com/office/drawing/2016/5/11/chartex" xmlns:cx6="http://schemas.microsoft.com/office/drawing/2016/5/12/chartex" xmlns:cx7="http://schemas.microsoft.com/office/drawing/2016/5/13/chartex" xmlns:cx8="http://schemas.microsoft.com/office/drawing/2016/5/14/chartex" xmlns:mc="http://schemas.openxmlformats.org/markup-compatibility/2006" xmlns:aink="http://schemas.microsoft.com/office/drawing/2016/ink" xmlns:am3d="http://schemas.microsoft.com/office/drawing/2017/model3d" xmlns:o="urn:schemas-microsoft-com:office:office" xmlns:r="http://schemas.openxmlformats.org/officeDocument/2006/relationships" xmlns:m="http://schemas.openxmlformats.org/officeDocument/2006/math" xmlns:v="urn:schemas-microsoft-com:vml" xmlns:wp14="http://schemas.microsoft.com/office/word/2010/wordprocessingDrawing" xmlns:wp="http://schemas.openxmlformats.org/drawingml/2006/wordprocessingDrawing" xmlns:w10="urn:schemas-microsoft-com:office:word" xmlns:w="http://schemas.openxmlformats.org/wordprocessingml/2006/main" xmlns:w14="http://schemas.microsoft.com/office/word/2010/wordml" xmlns:w15="http://schemas.microsoft.com/office/word/2012/wordml" xmlns:w16cex="http://schemas.microsoft.com/office/word/2018/wordml/cex" xmlns:w16cid="http://schemas.microsoft.com/office/word/2016/wordml/cid" xmlns:w16="http://schemas.microsoft.com/office/word/2018/wordml" xmlns:w16sdtdh="http://schemas.microsoft.com/office/word/2020/wordml/sdtdatahash" xmlns:w16se="http://schemas.microsoft.com/office/word/2015/wordml/symex" xmlns:wpg="http://schemas.microsoft.com/office/word/2010/wordprocessingGroup" xmlns:wpi="http://schemas.microsoft.com/office/word/2010/wordprocessingInk" xmlns:wne="http://schemas.microsoft.com/office/word/2006/wordml" xmlns:wps="http://schemas.microsoft.com/office/word/2010/wordprocessingShape" mc:Ignorable="w14 w15 w16se w16cid w16 w16cex w16sdtdh wp14">
   <w:body>
+    <w:p>
+      <w:pPr>
+        <w:jc w:val="center"/>
+        <w:rPr>
+          <w:rFonts w:ascii="Times New Roman" w:hAnsi="Times New Roman" w:cs="Times New Roman"/>
+        </w:rPr>
+      </w:pPr>
+      <w:r>
+        <w:rPr>
+          <w:rFonts w:ascii="Times New Roman" w:hAnsi="Times New Roman" w:cs="Times New Roman"/>
+          <w:b/>
+          <w:bCs/>
+        </w:rPr>
+        <w:t>СЦЕНАРИЙ: ЗАЩИТИТЬСЯ ОТ ПРЕТЕНЗИИ О НАРУШЕНИИ ПРАВ</w:t>
+      </w:r>
+    </w:p>
     <w:p>
       <w:pPr>
         <w:pBdr>
@@ -53,17 +69,7 @@
           <w:sz w:val="26"/>
           <w:szCs w:val="26"/>
         </w:rPr>
-        <w:t>Материал носит общий информационный характер и не заменяет консультацию юриста по вашему делу</w:t>
-      </w:r>
-      <w:r>
-        <w:rPr>
-          <w:rFonts w:ascii="Times New Roman" w:hAnsi="Times New Roman" w:cs="Times New Roman"/>
-          <w:i/>
-          <w:iCs/>
-          <w:sz w:val="26"/>
-          <w:szCs w:val="26"/>
-        </w:rPr>
-        <w:t>.</w:t>
+        <w:t>Материал носит общий информационный характер и не заменяет консультацию юриста по вашему делу.</w:t>
       </w:r>
       <w:r>
         <w:rPr>
@@ -97,7 +103,31 @@
           <w:sz w:val="24"/>
           <w:szCs w:val="24"/>
         </w:rPr>
-        <w:t>13.10.2026.</w:t>
+        <w:t>1</w:t>
+      </w:r>
+      <w:r>
+        <w:rPr>
+          <w:rFonts w:ascii="Times New Roman" w:hAnsi="Times New Roman" w:cs="Times New Roman"/>
+          <w:b/>
+          <w:bCs/>
+          <w:i/>
+          <w:iCs/>
+          <w:sz w:val="24"/>
+          <w:szCs w:val="24"/>
+        </w:rPr>
+        <w:t>8</w:t>
+      </w:r>
+      <w:r>
+        <w:rPr>
+          <w:rFonts w:ascii="Times New Roman" w:hAnsi="Times New Roman" w:cs="Times New Roman"/>
+          <w:b/>
+          <w:bCs/>
+          <w:i/>
+          <w:iCs/>
+          <w:sz w:val="24"/>
+          <w:szCs w:val="24"/>
+        </w:rPr>
+        <w:t>.10.2026.</w:t>
       </w:r>
       <w:r>
         <w:rPr>
@@ -331,9 +361,8 @@
         <w:spacing w:after="100"/>
         <w:jc w:val="both"/>
         <w:rPr>
-          <w:rFonts w:ascii="Times New Roman" w:hAnsi="Times New Roman" w:cs="Times New Roman"/>
-          <w:sz w:val="26"/>
-          <w:szCs w:val="26"/>
+          <w:sz w:val="24"/>
+          <w:szCs w:val="24"/>
         </w:rPr>
       </w:pPr>
       <w:r>
@@ -358,37 +387,24 @@
           <w:sz w:val="26"/>
           <w:szCs w:val="26"/>
         </w:rPr>
-        <w:t>: обозначение, на которое только подана заявка (до регистрации), названия некоммерческих организаций и СМИ, доменные имена. Нормы о товарных знаках к ним не применяются, но права на названия некоммерческих организаций, СМИ и домены при определённых обстоятельствах можно защитить общими способами защиты гражданских прав (</w:t>
+        <w:t xml:space="preserve">: обозначение, на которое только подана заявка (до регистрации), названия некоммерческих организаций и СМИ, доменные имена. Нормы о товарных знаках к ним не применяются, но права на названия некоммерческих организаций, СМИ и домены при определённых обстоятельствах можно защитить общими способами защиты гражданских прав </w:t>
+      </w:r>
+      <w:r>
+        <w:rPr>
+          <w:rFonts w:ascii="Times New Roman" w:hAnsi="Times New Roman" w:cs="Times New Roman"/>
+          <w:sz w:val="26"/>
+          <w:szCs w:val="26"/>
+        </w:rPr>
+        <w:t>(</w:t>
       </w:r>
       <w:hyperlink r:id="rId10" w:history="1">
         <w:r>
           <w:rPr>
             <w:rFonts w:ascii="Times New Roman" w:hAnsi="Times New Roman" w:cs="Times New Roman"/>
-            <w:b/>
-            <w:bCs/>
             <w:sz w:val="26"/>
             <w:szCs w:val="26"/>
           </w:rPr>
-          <w:t>С</w:t>
-        </w:r>
-        <w:r>
-          <w:rPr>
-            <w:rFonts w:ascii="Times New Roman" w:hAnsi="Times New Roman" w:cs="Times New Roman"/>
-            <w:b/>
-            <w:bCs/>
-            <w:sz w:val="26"/>
-            <w:szCs w:val="26"/>
-          </w:rPr>
-          <w:t>м.</w:t>
-        </w:r>
-        <w:r>
-          <w:rPr>
-            <w:rStyle w:val="a5"/>
-            <w:rFonts w:ascii="Times New Roman" w:hAnsi="Times New Roman" w:cs="Times New Roman"/>
-            <w:sz w:val="26"/>
-            <w:szCs w:val="26"/>
-          </w:rPr>
-          <w:t xml:space="preserve"> п. 155  и п. 33 Постановления Пленума Верховного Суда РФ от 23.04.2019 № 10, далее – ПП ВС РФ № 10</w:t>
+          <w:t>п. 155  и п. 33 Постановления Пленума Верховного Суда РФ от 23.04.2019 № 10, далее – ПП ВС РФ № 10</w:t>
         </w:r>
       </w:hyperlink>
       <w:r>
@@ -746,13 +762,19 @@
           <w:sz w:val="26"/>
           <w:szCs w:val="26"/>
         </w:rPr>
-        <w:t xml:space="preserve"> (</w:t>
-      </w:r>
-      <w:r>
-        <w:rPr>
-          <w:rFonts w:ascii="Times New Roman" w:hAnsi="Times New Roman" w:cs="Times New Roman"/>
-          <w:b/>
-          <w:bCs/>
+        <w:t xml:space="preserve"> </w:t>
+      </w:r>
+      <w:r>
+        <w:rPr>
+          <w:rFonts w:ascii="Times New Roman" w:hAnsi="Times New Roman" w:cs="Times New Roman"/>
+          <w:sz w:val="26"/>
+          <w:szCs w:val="26"/>
+        </w:rPr>
+        <w:t>(</w:t>
+      </w:r>
+      <w:r>
+        <w:rPr>
+          <w:rFonts w:ascii="Times New Roman" w:hAnsi="Times New Roman" w:cs="Times New Roman"/>
           <w:sz w:val="26"/>
           <w:szCs w:val="26"/>
         </w:rPr>
@@ -761,25 +783,14 @@
       <w:r>
         <w:rPr>
           <w:rFonts w:ascii="Times New Roman" w:hAnsi="Times New Roman" w:cs="Times New Roman"/>
-          <w:b/>
-          <w:bCs/>
-          <w:sz w:val="26"/>
-          <w:szCs w:val="26"/>
-        </w:rPr>
-        <w:t>м.</w:t>
-      </w:r>
-      <w:r>
-        <w:rPr>
-          <w:rFonts w:ascii="Times New Roman" w:hAnsi="Times New Roman" w:cs="Times New Roman"/>
-          <w:sz w:val="26"/>
-          <w:szCs w:val="26"/>
-        </w:rPr>
-        <w:t xml:space="preserve"> </w:t>
+          <w:sz w:val="26"/>
+          <w:szCs w:val="26"/>
+        </w:rPr>
+        <w:t xml:space="preserve">м. </w:t>
       </w:r>
       <w:hyperlink r:id="rId13" w:history="1">
         <w:r>
           <w:rPr>
-            <w:rStyle w:val="a5"/>
             <w:rFonts w:ascii="Times New Roman" w:hAnsi="Times New Roman" w:cs="Times New Roman"/>
             <w:sz w:val="26"/>
             <w:szCs w:val="26"/>
@@ -813,6 +824,7 @@
           <w:sz w:val="26"/>
           <w:szCs w:val="26"/>
         </w:rPr>
+        <w:lastRenderedPageBreak/>
         <w:t>При оценке сходства не учитывают совпадение только тех элементов товарного знака, которые не получили правовую охрану, например общепринятых обозначений товаров или услуг</w:t>
       </w:r>
       <w:r>
@@ -841,13 +853,27 @@
           <w:sz w:val="26"/>
           <w:szCs w:val="26"/>
         </w:rPr>
-        <w:lastRenderedPageBreak/>
-        <w:t>Также важны известность знака, срок и объём его использования, внимательность покупателей. Реальное смешение доказывать не нужно: достаточно его опасности (</w:t>
+        <w:t xml:space="preserve">Также важны известность знака, срок и объём его использования, внимательность покупателей. Реальное смешение доказывать не нужно: достаточно его опасности </w:t>
+      </w:r>
+      <w:r>
+        <w:rPr>
+          <w:rFonts w:ascii="Times New Roman" w:hAnsi="Times New Roman" w:cs="Times New Roman"/>
+          <w:sz w:val="26"/>
+          <w:szCs w:val="26"/>
+        </w:rPr>
+        <w:t>(</w:t>
+      </w:r>
+      <w:r>
+        <w:rPr>
+          <w:rFonts w:ascii="Times New Roman" w:hAnsi="Times New Roman" w:cs="Times New Roman"/>
+          <w:sz w:val="26"/>
+          <w:szCs w:val="26"/>
+        </w:rPr>
+        <w:t xml:space="preserve">См. </w:t>
       </w:r>
       <w:hyperlink r:id="rId14" w:history="1">
         <w:r>
           <w:rPr>
-            <w:rStyle w:val="a5"/>
             <w:rFonts w:ascii="Times New Roman" w:hAnsi="Times New Roman" w:cs="Times New Roman"/>
             <w:sz w:val="26"/>
             <w:szCs w:val="26"/>
@@ -856,7 +882,6 @@
         </w:r>
         <w:r>
           <w:rPr>
-            <w:rStyle w:val="a5"/>
             <w:rFonts w:ascii="Times New Roman" w:hAnsi="Times New Roman" w:cs="Times New Roman"/>
             <w:sz w:val="26"/>
             <w:szCs w:val="26"/>
@@ -1639,6 +1664,7 @@
                 <w:sz w:val="24"/>
                 <w:szCs w:val="24"/>
               </w:rPr>
+              <w:lastRenderedPageBreak/>
               <w:t>Стоимость контрафактных товаров</w:t>
             </w:r>
           </w:p>
@@ -1731,7 +1757,6 @@
                 <w:sz w:val="24"/>
                 <w:szCs w:val="24"/>
               </w:rPr>
-              <w:lastRenderedPageBreak/>
               <w:t>Стоимость права использования знака</w:t>
             </w:r>
           </w:p>
@@ -2479,7 +2504,16 @@
           <w:sz w:val="26"/>
           <w:szCs w:val="26"/>
         </w:rPr>
-        <w:t>, что нарушаете чужое право, суд может определить компенсацию в пределах от 10 000 до 500 000 руб. (при твёрдой сумме) либо от одно- до двукратной стоимости товаров или права использования (при других способах) (</w:t>
+        <w:t xml:space="preserve">, что нарушаете чужое право, суд может определить компенсацию в пределах от </w:t>
+      </w:r>
+      <w:r>
+        <w:rPr>
+          <w:rFonts w:ascii="Times New Roman" w:hAnsi="Times New Roman" w:cs="Times New Roman"/>
+          <w:sz w:val="26"/>
+          <w:szCs w:val="26"/>
+        </w:rPr>
+        <w:lastRenderedPageBreak/>
+        <w:t>10 000 до 500 000 руб. (при твёрдой сумме) либо от одно- до двукратной стоимости товаров или права использования (при других способах) (</w:t>
       </w:r>
       <w:hyperlink r:id="rId34" w:history="1">
         <w:r>
@@ -2522,7 +2556,6 @@
           <w:sz w:val="26"/>
           <w:szCs w:val="26"/>
         </w:rPr>
-        <w:lastRenderedPageBreak/>
         <w:t xml:space="preserve">суд </w:t>
       </w:r>
       <w:r>
@@ -2659,7 +2692,6 @@
       <w:hyperlink r:id="rId35" w:history="1">
         <w:r>
           <w:rPr>
-            <w:rStyle w:val="a5"/>
             <w:rFonts w:ascii="Times New Roman" w:hAnsi="Times New Roman" w:cs="Times New Roman"/>
             <w:sz w:val="26"/>
             <w:szCs w:val="26"/>
@@ -2673,7 +2705,15 @@
           <w:sz w:val="26"/>
           <w:szCs w:val="26"/>
         </w:rPr>
-        <w:t>: действует ли охрана, кто владелец, для каких товаров, какая дата приоритета.</w:t>
+        <w:t xml:space="preserve">: </w:t>
+      </w:r>
+      <w:r>
+        <w:rPr>
+          <w:rFonts w:ascii="Times New Roman" w:hAnsi="Times New Roman" w:cs="Times New Roman"/>
+          <w:sz w:val="26"/>
+          <w:szCs w:val="26"/>
+        </w:rPr>
+        <w:t>действует ли охрана, кто владелец, для каких товаров, какая дата приоритета.</w:t>
       </w:r>
     </w:p>
     <w:p>
@@ -3697,6 +3737,7 @@
                 <w:sz w:val="26"/>
                 <w:szCs w:val="26"/>
               </w:rPr>
+              <w:lastRenderedPageBreak/>
               <w:t>Оспаривание регистрации (</w:t>
             </w:r>
             <w:hyperlink r:id="rId40" w:history="1">
@@ -3881,7 +3922,6 @@
           <w:sz w:val="24"/>
           <w:szCs w:val="24"/>
         </w:rPr>
-        <w:lastRenderedPageBreak/>
         <w:t>Обратите внимание</w:t>
       </w:r>
       <w:r>

</xml_diff>

<commit_message>
Update legal materials and freshness notices for October 21
</commit_message>
<xml_diff>
--- a/content/files/brand-claim.docx
+++ b/content/files/brand-claim.docx
@@ -401,12 +401,50 @@
         <w:r>
           <w:rPr>
             <w:rFonts w:ascii="Times New Roman" w:hAnsi="Times New Roman" w:cs="Times New Roman"/>
+            <w:color w:val="0563C1"/>
             <w:sz w:val="26"/>
             <w:szCs w:val="26"/>
+            <w:u w:val="single"/>
           </w:rPr>
-          <w:t>п. 155  и п. 33 Постановления Пленума Верховного Суда РФ от 23.04.2019 № 10, далее – ПП ВС РФ № 10</w:t>
+          <w:t>п. 155</w:t>
         </w:r>
       </w:hyperlink>
+      <w:r>
+        <w:rPr>
+          <w:rFonts w:ascii="Times New Roman" w:hAnsi="Times New Roman" w:cs="Times New Roman"/>
+          <w:sz w:val="26"/>
+          <w:szCs w:val="26"/>
+        </w:rPr>
+        <w:t>,</w:t>
+      </w:r>
+      <w:r>
+        <w:rPr>
+          <w:rFonts w:ascii="Times New Roman" w:hAnsi="Times New Roman" w:cs="Times New Roman"/>
+          <w:sz w:val="26"/>
+          <w:szCs w:val="26"/>
+        </w:rPr>
+        <w:t xml:space="preserve"> </w:t>
+      </w:r>
+      <w:hyperlink r:id="rId11" w:history="1">
+        <w:r>
+          <w:rPr>
+            <w:rFonts w:ascii="Times New Roman" w:hAnsi="Times New Roman" w:cs="Times New Roman"/>
+            <w:color w:val="0563C1"/>
+            <w:sz w:val="26"/>
+            <w:szCs w:val="26"/>
+            <w:u w:val="single"/>
+          </w:rPr>
+          <w:t>п. 33 Постановления Пленума Верховного Суда РФ от 23.04.2019 № 10</w:t>
+        </w:r>
+      </w:hyperlink>
+      <w:r>
+        <w:rPr>
+          <w:rFonts w:ascii="Times New Roman" w:hAnsi="Times New Roman" w:cs="Times New Roman"/>
+          <w:sz w:val="26"/>
+          <w:szCs w:val="26"/>
+        </w:rPr>
+        <w:t>, далее – ПП ВС РФ № 10</w:t>
+      </w:r>
       <w:r>
         <w:rPr>
           <w:rFonts w:ascii="Times New Roman" w:hAnsi="Times New Roman" w:cs="Times New Roman"/>
@@ -512,7 +550,7 @@
         </w:rPr>
         <w:t xml:space="preserve"> (</w:t>
       </w:r>
-      <w:hyperlink r:id="rId11" w:history="1">
+      <w:hyperlink r:id="rId12" w:history="1">
         <w:r>
           <w:rPr>
             <w:rStyle w:val="a5"/>
@@ -615,7 +653,7 @@
         </w:rPr>
         <w:t>: на товаре, этикетке, упаковке, при оказании услуг, в документах по продаже, в объявлениях, на вывеске, в рекламе, в интернете, в том числе в доменном имени (</w:t>
       </w:r>
-      <w:hyperlink r:id="rId12" w:history="1">
+      <w:hyperlink r:id="rId13" w:history="1">
         <w:r>
           <w:rPr>
             <w:rStyle w:val="a5"/>
@@ -788,12 +826,14 @@
         </w:rPr>
         <w:t xml:space="preserve">м. </w:t>
       </w:r>
-      <w:hyperlink r:id="rId13" w:history="1">
+      <w:hyperlink r:id="rId14" w:history="1">
         <w:r>
           <w:rPr>
             <w:rFonts w:ascii="Times New Roman" w:hAnsi="Times New Roman" w:cs="Times New Roman"/>
+            <w:color w:val="0563C1"/>
             <w:sz w:val="26"/>
             <w:szCs w:val="26"/>
+            <w:u w:val="single"/>
           </w:rPr>
           <w:t>Правила, утв Приказом Минэкономразвития России от 20.07.2015 № 482</w:t>
         </w:r>
@@ -871,20 +911,24 @@
         </w:rPr>
         <w:t xml:space="preserve">См. </w:t>
       </w:r>
-      <w:hyperlink r:id="rId14" w:history="1">
+      <w:hyperlink r:id="rId15" w:history="1">
         <w:r>
           <w:rPr>
             <w:rFonts w:ascii="Times New Roman" w:hAnsi="Times New Roman" w:cs="Times New Roman"/>
+            <w:color w:val="0563C1"/>
             <w:sz w:val="26"/>
             <w:szCs w:val="26"/>
+            <w:u w:val="single"/>
           </w:rPr>
           <w:t xml:space="preserve">п. 162 ПП ВС РФ </w:t>
         </w:r>
         <w:r>
           <w:rPr>
             <w:rFonts w:ascii="Times New Roman" w:hAnsi="Times New Roman" w:cs="Times New Roman"/>
+            <w:color w:val="0563C1"/>
             <w:sz w:val="26"/>
             <w:szCs w:val="26"/>
+            <w:u w:val="single"/>
           </w:rPr>
           <w:t>№ 10</w:t>
         </w:r>
@@ -1136,7 +1180,7 @@
         </w:rPr>
         <w:t xml:space="preserve">Первая компания вправе потребовать от второй прекратить использование сходного фирменного наименования. Согласно </w:t>
       </w:r>
-      <w:hyperlink r:id="rId15" w:history="1">
+      <w:hyperlink r:id="rId16" w:history="1">
         <w:r>
           <w:rPr>
             <w:rStyle w:val="a5"/>
@@ -1163,7 +1207,7 @@
         </w:rPr>
         <w:t xml:space="preserve">, а также должен возместить убытки (аналогично с коммерческим обозначением – </w:t>
       </w:r>
-      <w:hyperlink r:id="rId16" w:history="1">
+      <w:hyperlink r:id="rId17" w:history="1">
         <w:r>
           <w:rPr>
             <w:rStyle w:val="a5"/>
@@ -1262,7 +1306,7 @@
         </w:rPr>
         <w:t>Вместо компенсации правообладатель может потребовать возмещения убытков, но тогда он сам должен доказать их размер: упущенную выгоду, лицензионное вознаграждение, которое он мог получить, потери из-за ущерба репутации (</w:t>
       </w:r>
-      <w:hyperlink r:id="rId17" w:history="1">
+      <w:hyperlink r:id="rId18" w:history="1">
         <w:r>
           <w:rPr>
             <w:rStyle w:val="a5"/>
@@ -1296,83 +1340,6 @@
           <w:szCs w:val="26"/>
         </w:rPr>
         <w:t>(</w:t>
-      </w:r>
-      <w:hyperlink r:id="rId18" w:history="1">
-        <w:r>
-          <w:rPr>
-            <w:rStyle w:val="a5"/>
-            <w:rFonts w:ascii="Times New Roman" w:hAnsi="Times New Roman" w:cs="Times New Roman"/>
-            <w:sz w:val="26"/>
-            <w:szCs w:val="26"/>
-          </w:rPr>
-          <w:t>п. 1 ст. 1252.1 ГК РФ</w:t>
-        </w:r>
-      </w:hyperlink>
-      <w:r>
-        <w:rPr>
-          <w:rFonts w:ascii="Times New Roman" w:hAnsi="Times New Roman" w:cs="Times New Roman"/>
-          <w:sz w:val="26"/>
-          <w:szCs w:val="26"/>
-        </w:rPr>
-        <w:t>).</w:t>
-      </w:r>
-    </w:p>
-    <w:p>
-      <w:pPr>
-        <w:spacing w:after="100"/>
-        <w:ind w:firstLine="567"/>
-        <w:jc w:val="both"/>
-        <w:rPr>
-          <w:rFonts w:ascii="Times New Roman" w:hAnsi="Times New Roman" w:cs="Times New Roman"/>
-          <w:sz w:val="26"/>
-          <w:szCs w:val="26"/>
-        </w:rPr>
-      </w:pPr>
-      <w:r>
-        <w:rPr>
-          <w:rFonts w:ascii="Times New Roman" w:hAnsi="Times New Roman" w:cs="Times New Roman"/>
-          <w:b/>
-          <w:bCs/>
-          <w:color w:val="0D0D0D" w:themeColor="text1" w:themeTint="F2"/>
-          <w:sz w:val="26"/>
-          <w:szCs w:val="26"/>
-        </w:rPr>
-        <w:t>Компенсация вместо убытков.</w:t>
-      </w:r>
-      <w:r>
-        <w:rPr>
-          <w:rFonts w:ascii="Times New Roman" w:hAnsi="Times New Roman" w:cs="Times New Roman"/>
-          <w:b/>
-          <w:bCs/>
-          <w:color w:val="0D0D0D" w:themeColor="text1" w:themeTint="F2"/>
-          <w:sz w:val="26"/>
-          <w:szCs w:val="26"/>
-        </w:rPr>
-        <w:t xml:space="preserve"> </w:t>
-      </w:r>
-      <w:r>
-        <w:rPr>
-          <w:rFonts w:ascii="Times New Roman" w:hAnsi="Times New Roman" w:cs="Times New Roman"/>
-          <w:sz w:val="26"/>
-          <w:szCs w:val="26"/>
-        </w:rPr>
-        <w:t>Если кто-то незаконно использовал чужой товарный знак, его владелец может потребовать не возмещения убытков, а компенсацию — установленную законом денежную сумму.</w:t>
-      </w:r>
-      <w:r>
-        <w:rPr>
-          <w:rFonts w:ascii="Times New Roman" w:hAnsi="Times New Roman" w:cs="Times New Roman"/>
-          <w:sz w:val="26"/>
-          <w:szCs w:val="26"/>
-        </w:rPr>
-        <w:t xml:space="preserve"> Для </w:t>
-      </w:r>
-      <w:r>
-        <w:rPr>
-          <w:rFonts w:ascii="Times New Roman" w:hAnsi="Times New Roman" w:cs="Times New Roman"/>
-          <w:sz w:val="26"/>
-          <w:szCs w:val="26"/>
-        </w:rPr>
-        <w:t>этого ему достаточно доказать сам факт нарушения, размер своих убытков доказывать не нужно (</w:t>
       </w:r>
       <w:hyperlink r:id="rId19" w:history="1">
         <w:r>
@@ -1391,9 +1358,86 @@
           <w:sz w:val="26"/>
           <w:szCs w:val="26"/>
         </w:rPr>
+        <w:t>).</w:t>
+      </w:r>
+    </w:p>
+    <w:p>
+      <w:pPr>
+        <w:spacing w:after="100"/>
+        <w:ind w:firstLine="567"/>
+        <w:jc w:val="both"/>
+        <w:rPr>
+          <w:rFonts w:ascii="Times New Roman" w:hAnsi="Times New Roman" w:cs="Times New Roman"/>
+          <w:sz w:val="26"/>
+          <w:szCs w:val="26"/>
+        </w:rPr>
+      </w:pPr>
+      <w:r>
+        <w:rPr>
+          <w:rFonts w:ascii="Times New Roman" w:hAnsi="Times New Roman" w:cs="Times New Roman"/>
+          <w:b/>
+          <w:bCs/>
+          <w:color w:val="0D0D0D" w:themeColor="text1" w:themeTint="F2"/>
+          <w:sz w:val="26"/>
+          <w:szCs w:val="26"/>
+        </w:rPr>
+        <w:t>Компенсация вместо убытков.</w:t>
+      </w:r>
+      <w:r>
+        <w:rPr>
+          <w:rFonts w:ascii="Times New Roman" w:hAnsi="Times New Roman" w:cs="Times New Roman"/>
+          <w:b/>
+          <w:bCs/>
+          <w:color w:val="0D0D0D" w:themeColor="text1" w:themeTint="F2"/>
+          <w:sz w:val="26"/>
+          <w:szCs w:val="26"/>
+        </w:rPr>
+        <w:t xml:space="preserve"> </w:t>
+      </w:r>
+      <w:r>
+        <w:rPr>
+          <w:rFonts w:ascii="Times New Roman" w:hAnsi="Times New Roman" w:cs="Times New Roman"/>
+          <w:sz w:val="26"/>
+          <w:szCs w:val="26"/>
+        </w:rPr>
+        <w:t>Если кто-то незаконно использовал чужой товарный знак, его владелец может потребовать не возмещения убытков, а компенсацию — установленную законом денежную сумму.</w:t>
+      </w:r>
+      <w:r>
+        <w:rPr>
+          <w:rFonts w:ascii="Times New Roman" w:hAnsi="Times New Roman" w:cs="Times New Roman"/>
+          <w:sz w:val="26"/>
+          <w:szCs w:val="26"/>
+        </w:rPr>
+        <w:t xml:space="preserve"> Для </w:t>
+      </w:r>
+      <w:r>
+        <w:rPr>
+          <w:rFonts w:ascii="Times New Roman" w:hAnsi="Times New Roman" w:cs="Times New Roman"/>
+          <w:sz w:val="26"/>
+          <w:szCs w:val="26"/>
+        </w:rPr>
+        <w:t>этого ему достаточно доказать сам факт нарушения, размер своих убытков доказывать не нужно (</w:t>
+      </w:r>
+      <w:hyperlink r:id="rId20" w:history="1">
+        <w:r>
+          <w:rPr>
+            <w:rStyle w:val="a5"/>
+            <w:rFonts w:ascii="Times New Roman" w:hAnsi="Times New Roman" w:cs="Times New Roman"/>
+            <w:sz w:val="26"/>
+            <w:szCs w:val="26"/>
+          </w:rPr>
+          <w:t>п. 1 ст. 1252.1 ГК РФ</w:t>
+        </w:r>
+      </w:hyperlink>
+      <w:r>
+        <w:rPr>
+          <w:rFonts w:ascii="Times New Roman" w:hAnsi="Times New Roman" w:cs="Times New Roman"/>
+          <w:sz w:val="26"/>
+          <w:szCs w:val="26"/>
+        </w:rPr>
         <w:t>). Способ расчёта выбирает правообладатель (</w:t>
       </w:r>
-      <w:hyperlink r:id="rId20" w:history="1">
+      <w:hyperlink r:id="rId21" w:history="1">
         <w:r>
           <w:rPr>
             <w:rStyle w:val="a5"/>
@@ -1839,7 +1883,7 @@
         </w:rPr>
         <w:t>Если выбранный способ расчёта не подходит к обстоятельствам дела, суд вправе взыскать компенсацию в твёрдой сумме (</w:t>
       </w:r>
-      <w:hyperlink r:id="rId21" w:history="1">
+      <w:hyperlink r:id="rId22" w:history="1">
         <w:r>
           <w:rPr>
             <w:rStyle w:val="a5"/>
@@ -1898,7 +1942,7 @@
         </w:rPr>
         <w:t>Нарушением признаётся незаконное использование одного средства индивидуализации одним способом (</w:t>
       </w:r>
-      <w:hyperlink r:id="rId22" w:history="1">
+      <w:hyperlink r:id="rId23" w:history="1">
         <w:r>
           <w:rPr>
             <w:rStyle w:val="a5"/>
@@ -1915,43 +1959,9 @@
           <w:sz w:val="26"/>
           <w:szCs w:val="26"/>
         </w:rPr>
-        <w:t xml:space="preserve">). Пример: одно и то же спорное название вы разместили на этикетке, в рекламе и на сайте. Правообладатель может попробовать насчитать компенсацию за каждый способ использования. Если на одном носителе использовано несколько чужих знаков, действуют отдельные правила подсчёта </w:t>
-      </w:r>
-      <w:r>
-        <w:rPr>
-          <w:rFonts w:ascii="Times New Roman" w:hAnsi="Times New Roman" w:cs="Times New Roman"/>
-          <w:sz w:val="26"/>
-          <w:szCs w:val="26"/>
-        </w:rPr>
-        <w:t xml:space="preserve">– </w:t>
-      </w:r>
-      <w:r>
-        <w:rPr>
-          <w:rFonts w:ascii="Times New Roman" w:hAnsi="Times New Roman" w:cs="Times New Roman"/>
-          <w:b/>
-          <w:bCs/>
-          <w:sz w:val="26"/>
-          <w:szCs w:val="26"/>
-        </w:rPr>
-        <w:t>см. таблицу выше</w:t>
-      </w:r>
-      <w:r>
-        <w:rPr>
-          <w:rFonts w:ascii="Times New Roman" w:hAnsi="Times New Roman" w:cs="Times New Roman"/>
-          <w:sz w:val="26"/>
-          <w:szCs w:val="26"/>
-        </w:rPr>
-        <w:t xml:space="preserve"> </w:t>
-      </w:r>
-      <w:r>
-        <w:rPr>
-          <w:rFonts w:ascii="Times New Roman" w:hAnsi="Times New Roman" w:cs="Times New Roman"/>
-          <w:sz w:val="26"/>
-          <w:szCs w:val="26"/>
-        </w:rPr>
-        <w:t>(</w:t>
-      </w:r>
-      <w:hyperlink r:id="rId23" w:history="1">
+        <w:t>). Пример: одно и то же спорное название вы разместили на этикетке, в рекламе и на сайте. Правообладатель может попробовать насчитать компенсацию за каждый способ использования. Если на одном носителе использовано несколько чужих знаков, действуют отдельные правила подсчёта (</w:t>
+      </w:r>
+      <w:hyperlink r:id="rId24" w:history="1">
         <w:r>
           <w:rPr>
             <w:rStyle w:val="a5"/>
@@ -1968,7 +1978,35 @@
           <w:sz w:val="26"/>
           <w:szCs w:val="26"/>
         </w:rPr>
-        <w:t>).</w:t>
+        <w:t>)</w:t>
+      </w:r>
+      <w:r>
+        <w:rPr>
+          <w:rFonts w:ascii="Times New Roman" w:hAnsi="Times New Roman" w:cs="Times New Roman"/>
+          <w:sz w:val="26"/>
+          <w:szCs w:val="26"/>
+        </w:rPr>
+        <w:t xml:space="preserve"> – </w:t>
+      </w:r>
+      <w:r>
+        <w:rPr>
+          <w:rFonts w:ascii="Times New Roman" w:hAnsi="Times New Roman" w:cs="Times New Roman"/>
+          <w:b/>
+          <w:bCs/>
+          <w:sz w:val="26"/>
+          <w:szCs w:val="26"/>
+        </w:rPr>
+        <w:t>см. таблицу выше</w:t>
+      </w:r>
+      <w:r>
+        <w:rPr>
+          <w:rFonts w:ascii="Times New Roman" w:hAnsi="Times New Roman" w:cs="Times New Roman"/>
+          <w:b/>
+          <w:bCs/>
+          <w:sz w:val="26"/>
+          <w:szCs w:val="26"/>
+        </w:rPr>
+        <w:t>.</w:t>
       </w:r>
     </w:p>
     <w:p>
@@ -2030,7 +2068,7 @@
         </w:rPr>
         <w:t>обеспечительные меры на время спора, в том числе арест товаров и запрет действий в интернете (</w:t>
       </w:r>
-      <w:hyperlink r:id="rId24" w:history="1">
+      <w:hyperlink r:id="rId25" w:history="1">
         <w:r>
           <w:rPr>
             <w:rStyle w:val="a5"/>
@@ -2073,7 +2111,7 @@
         </w:rPr>
         <w:t>изъять из оборота и уничтожить контрафактные товары, этикетки и упаковки за ваш счёт и без компенсации (</w:t>
       </w:r>
-      <w:hyperlink r:id="rId25" w:history="1">
+      <w:hyperlink r:id="rId26" w:history="1">
         <w:r>
           <w:rPr>
             <w:rStyle w:val="a5"/>
@@ -2092,7 +2130,7 @@
         </w:rPr>
         <w:t xml:space="preserve">, </w:t>
       </w:r>
-      <w:hyperlink r:id="rId26" w:history="1">
+      <w:hyperlink r:id="rId27" w:history="1">
         <w:r>
           <w:rPr>
             <w:rStyle w:val="a5"/>
@@ -2135,7 +2173,7 @@
         </w:rPr>
         <w:t>удалить знак с рекламы, вывесок и документации, если нарушение допущено при оказании услуг или выполнении работ (</w:t>
       </w:r>
-      <w:hyperlink r:id="rId27" w:history="1">
+      <w:hyperlink r:id="rId28" w:history="1">
         <w:r>
           <w:rPr>
             <w:rStyle w:val="a5"/>
@@ -2178,7 +2216,7 @@
         </w:rPr>
         <w:t>опубликовать решение суда о нарушении (</w:t>
       </w:r>
-      <w:hyperlink r:id="rId28" w:history="1">
+      <w:hyperlink r:id="rId29" w:history="1">
         <w:r>
           <w:rPr>
             <w:rStyle w:val="a5"/>
@@ -2237,7 +2275,7 @@
         </w:rPr>
         <w:t>В отдельных случаях возможна административная ответственность за незаконное использование чужого знака (</w:t>
       </w:r>
-      <w:hyperlink r:id="rId29" w:history="1">
+      <w:hyperlink r:id="rId30" w:history="1">
         <w:r>
           <w:rPr>
             <w:rStyle w:val="a5"/>
@@ -2256,7 +2294,7 @@
         </w:rPr>
         <w:t>) или за недобросовестную конкуренцию (</w:t>
       </w:r>
-      <w:hyperlink r:id="rId30" w:history="1">
+      <w:hyperlink r:id="rId31" w:history="1">
         <w:r>
           <w:rPr>
             <w:rStyle w:val="a5"/>
@@ -2275,7 +2313,7 @@
         </w:rPr>
         <w:t xml:space="preserve">, </w:t>
       </w:r>
-      <w:hyperlink r:id="rId31" w:history="1">
+      <w:hyperlink r:id="rId32" w:history="1">
         <w:r>
           <w:rPr>
             <w:rStyle w:val="a5"/>
@@ -2294,7 +2332,7 @@
         </w:rPr>
         <w:t>). Уголовная ответственность возможна, если использование сходного с чужим знаком обозначения для однородных товаров совершено неоднократно или причинён крупный ущерб, то есть более 400 000 руб. (</w:t>
       </w:r>
-      <w:hyperlink r:id="rId32" w:history="1">
+      <w:hyperlink r:id="rId33" w:history="1">
         <w:r>
           <w:rPr>
             <w:rStyle w:val="a5"/>
@@ -2375,7 +2413,7 @@
         </w:rPr>
         <w:t>Размер компенсации определяет суд соразмерно объёму и характеру нарушения, с учётом разумности и справедливости (</w:t>
       </w:r>
-      <w:hyperlink r:id="rId33" w:history="1">
+      <w:hyperlink r:id="rId34" w:history="1">
         <w:r>
           <w:rPr>
             <w:rStyle w:val="a5"/>
@@ -2515,7 +2553,7 @@
         <w:lastRenderedPageBreak/>
         <w:t>10 000 до 500 000 руб. (при твёрдой сумме) либо от одно- до двукратной стоимости товаров или права использования (при других способах) (</w:t>
       </w:r>
-      <w:hyperlink r:id="rId34" w:history="1">
+      <w:hyperlink r:id="rId35" w:history="1">
         <w:r>
           <w:rPr>
             <w:rStyle w:val="a5"/>
@@ -2689,7 +2727,7 @@
         </w:rPr>
         <w:t xml:space="preserve"> Найдите знак в </w:t>
       </w:r>
-      <w:hyperlink r:id="rId35" w:history="1">
+      <w:hyperlink r:id="rId36" w:history="1">
         <w:r>
           <w:rPr>
             <w:rFonts w:ascii="Times New Roman" w:hAnsi="Times New Roman" w:cs="Times New Roman"/>
@@ -3217,7 +3255,7 @@
               </w:rPr>
               <w:t>У вас право возникло раньше (</w:t>
             </w:r>
-            <w:hyperlink r:id="rId36" w:history="1">
+            <w:hyperlink r:id="rId37" w:history="1">
               <w:r>
                 <w:rPr>
                   <w:rStyle w:val="a5"/>
@@ -3228,24 +3266,17 @@
                 <w:t>п. 6 ст. 1252</w:t>
               </w:r>
             </w:hyperlink>
-            <w:r>
-              <w:rPr>
-                <w:rStyle w:val="a5"/>
-                <w:rFonts w:ascii="Times New Roman" w:hAnsi="Times New Roman" w:cs="Times New Roman"/>
-                <w:sz w:val="26"/>
-                <w:szCs w:val="26"/>
-              </w:rPr>
-              <w:t xml:space="preserve"> </w:t>
-            </w:r>
-            <w:r>
-              <w:rPr>
-                <w:rStyle w:val="a5"/>
-                <w:rFonts w:ascii="Times New Roman" w:hAnsi="Times New Roman" w:cs="Times New Roman"/>
-                <w:sz w:val="26"/>
-                <w:szCs w:val="26"/>
-              </w:rPr>
-              <w:t>ГК РФ</w:t>
-            </w:r>
+            <w:hyperlink r:id="rId38" w:history="1">
+              <w:r>
+                <w:rPr>
+                  <w:rStyle w:val="a5"/>
+                  <w:rFonts w:ascii="Times New Roman" w:hAnsi="Times New Roman" w:cs="Times New Roman"/>
+                  <w:sz w:val="26"/>
+                  <w:szCs w:val="26"/>
+                </w:rPr>
+                <w:t xml:space="preserve"> ГК РФ</w:t>
+              </w:r>
+            </w:hyperlink>
             <w:r>
               <w:rPr>
                 <w:rFonts w:ascii="Times New Roman" w:hAnsi="Times New Roman" w:cs="Times New Roman"/>
@@ -3362,7 +3393,7 @@
               </w:rPr>
               <w:t>Исчерпание права (</w:t>
             </w:r>
-            <w:hyperlink r:id="rId37" w:history="1">
+            <w:hyperlink r:id="rId39" w:history="1">
               <w:r>
                 <w:rPr>
                   <w:rStyle w:val="a5"/>
@@ -3373,24 +3404,17 @@
                 <w:t>ст. 1487</w:t>
               </w:r>
             </w:hyperlink>
-            <w:r>
-              <w:rPr>
-                <w:rStyle w:val="a5"/>
-                <w:rFonts w:ascii="Times New Roman" w:hAnsi="Times New Roman" w:cs="Times New Roman"/>
-                <w:sz w:val="26"/>
-                <w:szCs w:val="26"/>
-              </w:rPr>
-              <w:t xml:space="preserve"> </w:t>
-            </w:r>
-            <w:r>
-              <w:rPr>
-                <w:rStyle w:val="a5"/>
-                <w:rFonts w:ascii="Times New Roman" w:hAnsi="Times New Roman" w:cs="Times New Roman"/>
-                <w:sz w:val="26"/>
-                <w:szCs w:val="26"/>
-              </w:rPr>
-              <w:t>ГК РФ</w:t>
-            </w:r>
+            <w:hyperlink r:id="rId40" w:history="1">
+              <w:r>
+                <w:rPr>
+                  <w:rStyle w:val="a5"/>
+                  <w:rFonts w:ascii="Times New Roman" w:hAnsi="Times New Roman" w:cs="Times New Roman"/>
+                  <w:sz w:val="26"/>
+                  <w:szCs w:val="26"/>
+                </w:rPr>
+                <w:t xml:space="preserve"> ГК РФ</w:t>
+              </w:r>
+            </w:hyperlink>
             <w:r>
               <w:rPr>
                 <w:rFonts w:ascii="Times New Roman" w:hAnsi="Times New Roman" w:cs="Times New Roman"/>
@@ -3499,7 +3523,7 @@
               </w:rPr>
               <w:t>Знак не используется 3 года (</w:t>
             </w:r>
-            <w:hyperlink r:id="rId38" w:history="1">
+            <w:hyperlink r:id="rId41" w:history="1">
               <w:r>
                 <w:rPr>
                   <w:rStyle w:val="a5"/>
@@ -3510,24 +3534,17 @@
                 <w:t>ст. 1486</w:t>
               </w:r>
             </w:hyperlink>
-            <w:r>
-              <w:rPr>
-                <w:rStyle w:val="a5"/>
-                <w:rFonts w:ascii="Times New Roman" w:hAnsi="Times New Roman" w:cs="Times New Roman"/>
-                <w:sz w:val="26"/>
-                <w:szCs w:val="26"/>
-              </w:rPr>
-              <w:t xml:space="preserve"> </w:t>
-            </w:r>
-            <w:r>
-              <w:rPr>
-                <w:rStyle w:val="a5"/>
-                <w:rFonts w:ascii="Times New Roman" w:hAnsi="Times New Roman" w:cs="Times New Roman"/>
-                <w:sz w:val="26"/>
-                <w:szCs w:val="26"/>
-              </w:rPr>
-              <w:t>ГК РФ</w:t>
-            </w:r>
+            <w:hyperlink r:id="rId42" w:history="1">
+              <w:r>
+                <w:rPr>
+                  <w:rStyle w:val="a5"/>
+                  <w:rFonts w:ascii="Times New Roman" w:hAnsi="Times New Roman" w:cs="Times New Roman"/>
+                  <w:sz w:val="26"/>
+                  <w:szCs w:val="26"/>
+                </w:rPr>
+                <w:t xml:space="preserve"> ГК РФ</w:t>
+              </w:r>
+            </w:hyperlink>
             <w:r>
               <w:rPr>
                 <w:rFonts w:ascii="Times New Roman" w:hAnsi="Times New Roman" w:cs="Times New Roman"/>
@@ -3628,7 +3645,7 @@
               </w:rPr>
               <w:t>Злоупотребление правом (</w:t>
             </w:r>
-            <w:hyperlink r:id="rId39" w:history="1">
+            <w:hyperlink r:id="rId43" w:history="1">
               <w:r>
                 <w:rPr>
                   <w:rStyle w:val="a5"/>
@@ -3740,7 +3757,7 @@
               <w:lastRenderedPageBreak/>
               <w:t>Оспаривание регистрации (</w:t>
             </w:r>
-            <w:hyperlink r:id="rId40" w:history="1">
+            <w:hyperlink r:id="rId44" w:history="1">
               <w:r>
                 <w:rPr>
                   <w:rStyle w:val="a5"/>
@@ -3751,24 +3768,17 @@
                 <w:t>ст. 1512</w:t>
               </w:r>
             </w:hyperlink>
-            <w:r>
-              <w:rPr>
-                <w:rStyle w:val="a5"/>
-                <w:rFonts w:ascii="Times New Roman" w:hAnsi="Times New Roman" w:cs="Times New Roman"/>
-                <w:sz w:val="26"/>
-                <w:szCs w:val="26"/>
-              </w:rPr>
-              <w:t xml:space="preserve"> </w:t>
-            </w:r>
-            <w:r>
-              <w:rPr>
-                <w:rStyle w:val="a5"/>
-                <w:rFonts w:ascii="Times New Roman" w:hAnsi="Times New Roman" w:cs="Times New Roman"/>
-                <w:sz w:val="26"/>
-                <w:szCs w:val="26"/>
-              </w:rPr>
-              <w:t>ГК РФ</w:t>
-            </w:r>
+            <w:hyperlink r:id="rId45" w:history="1">
+              <w:r>
+                <w:rPr>
+                  <w:rStyle w:val="a5"/>
+                  <w:rFonts w:ascii="Times New Roman" w:hAnsi="Times New Roman" w:cs="Times New Roman"/>
+                  <w:sz w:val="26"/>
+                  <w:szCs w:val="26"/>
+                </w:rPr>
+                <w:t xml:space="preserve"> ГК РФ</w:t>
+              </w:r>
+            </w:hyperlink>
             <w:r>
               <w:rPr>
                 <w:rFonts w:ascii="Times New Roman" w:hAnsi="Times New Roman" w:cs="Times New Roman"/>
@@ -3777,7 +3787,7 @@
               </w:rPr>
               <w:t xml:space="preserve">, </w:t>
             </w:r>
-            <w:hyperlink r:id="rId41" w:history="1">
+            <w:hyperlink r:id="rId46" w:history="1">
               <w:r>
                 <w:rPr>
                   <w:rStyle w:val="a5"/>
@@ -4165,7 +4175,7 @@
         </w:rPr>
         <w:t xml:space="preserve"> Если спор между ИП или организациями рассматривает арбитражный суд, до иска о компенсации правообладатель обязан направить претензию; иск возможен, если вы отказали или не ответили в течение 30 дней со дня её отправки (</w:t>
       </w:r>
-      <w:hyperlink r:id="rId42" w:history="1">
+      <w:hyperlink r:id="rId47" w:history="1">
         <w:r>
           <w:rPr>
             <w:rStyle w:val="a5"/>
@@ -4184,7 +4194,7 @@
         </w:rPr>
         <w:t>). Срок давности общий — 3 года (</w:t>
       </w:r>
-      <w:hyperlink r:id="rId43" w:history="1">
+      <w:hyperlink r:id="rId48" w:history="1">
         <w:r>
           <w:rPr>
             <w:rStyle w:val="a5"/>
@@ -4203,7 +4213,7 @@
         </w:rPr>
         <w:t xml:space="preserve">, </w:t>
       </w:r>
-      <w:hyperlink r:id="rId44" w:history="1">
+      <w:hyperlink r:id="rId49" w:history="1">
         <w:r>
           <w:rPr>
             <w:rStyle w:val="a5"/>
@@ -4418,7 +4428,7 @@
       </w:r>
     </w:p>
     <w:sectPr>
-      <w:footerReference w:type="default" r:id="rId45"/>
+      <w:footerReference w:type="default" r:id="rId50"/>
       <w:pgSz w:w="11906" w:h="16838"/>
       <w:pgMar w:top="1134" w:right="1134" w:bottom="1134" w:left="1134" w:header="708" w:footer="708" w:gutter="0"/>
       <w:cols w:space="720"/>

</xml_diff>